<commit_message>
Credit Cooley, Simmons and Smith on plant research summary
</commit_message>
<xml_diff>
--- a/files/research-summaries/Smith-Puzey-Research-Summary.docx
+++ b/files/research-summaries/Smith-Puzey-Research-Summary.docx
@@ -18,10 +18,7 @@
         <w:pStyle w:val="Subtitle"/>
       </w:pPr>
       <w:r>
-        <w:rPr>
-          <w:color w:val="000000"/>
-        </w:rPr>
-        <w:t>Greg Conradi Smith | Collaboration with Joshua R. Puzey</w:t>
+        <w:t>Greg Conradi Smith, Joshua R. Puzey, Arielle Cooley, Emily Simmons and Ron Smith</w:t>
       </w:r>
     </w:p>
     <w:p>

</xml_diff>